<commit_message>
Update DQP with reasons for price clamping
</commit_message>
<xml_diff>
--- a/DQP/Data Quality Plan.docx
+++ b/DQP/Data Quality Plan.docx
@@ -81,7 +81,7 @@
       <w:pPr>
         <w:jc w:val="both"/>
         <w:rPr>
-          <w:rFonts w:ascii="Times New Roman" w:hAnsi="Times New Roman" w:cs="Times New Roman" w:hint="eastAsia"/>
+          <w:rFonts w:ascii="Times New Roman" w:hAnsi="Times New Roman" w:cs="Times New Roman"/>
           <w:sz w:val="22"/>
           <w:szCs w:val="22"/>
           <w:lang w:val="en-US"/>
@@ -243,7 +243,7 @@
       <w:pPr>
         <w:jc w:val="both"/>
         <w:rPr>
-          <w:rFonts w:ascii="Times New Roman" w:hAnsi="Times New Roman" w:cs="Times New Roman" w:hint="eastAsia"/>
+          <w:rFonts w:ascii="Times New Roman" w:hAnsi="Times New Roman" w:cs="Times New Roman"/>
           <w:sz w:val="22"/>
           <w:szCs w:val="22"/>
           <w:lang w:val="en-US"/>
@@ -1123,7 +1123,7 @@
       <w:pPr>
         <w:jc w:val="both"/>
         <w:rPr>
-          <w:rFonts w:ascii="Times New Roman" w:hAnsi="Times New Roman" w:cs="Times New Roman" w:hint="eastAsia"/>
+          <w:rFonts w:ascii="Times New Roman" w:hAnsi="Times New Roman" w:cs="Times New Roman"/>
           <w:sz w:val="22"/>
           <w:szCs w:val="22"/>
           <w:lang w:val="en-US"/>
@@ -2489,6 +2489,51 @@
         </w:rPr>
         <w:t xml:space="preserve"> Also, since Price is our target value, keeping its original scale remains top priority. </w:t>
       </w:r>
+      <w:r>
+        <w:rPr>
+          <w:rFonts w:ascii="Times New Roman" w:hAnsi="Times New Roman" w:cs="Times New Roman"/>
+          <w:sz w:val="22"/>
+          <w:szCs w:val="22"/>
+          <w:lang w:val="en-US"/>
+        </w:rPr>
+        <w:t xml:space="preserve">Another reason for choosing clamping is that some extreme values are associated with </w:t>
+      </w:r>
+      <w:r>
+        <w:rPr>
+          <w:rFonts w:ascii="Times New Roman" w:hAnsi="Times New Roman" w:cs="Times New Roman"/>
+          <w:sz w:val="22"/>
+          <w:szCs w:val="22"/>
+          <w:lang w:val="en-US"/>
+        </w:rPr>
+        <w:t>portfolio</w:t>
+      </w:r>
+      <w:r>
+        <w:rPr>
+          <w:rFonts w:ascii="Times New Roman" w:hAnsi="Times New Roman" w:cs="Times New Roman"/>
+          <w:sz w:val="22"/>
+          <w:szCs w:val="22"/>
+          <w:lang w:val="en-US"/>
+        </w:rPr>
+        <w:t xml:space="preserve"> transactions, such as the purchase of an entire building or multiple flats together, which is not the focus of our research. In this way, clamping can also help minimize the distorted influence of </w:t>
+      </w:r>
+      <w:r>
+        <w:rPr>
+          <w:rFonts w:ascii="Times New Roman" w:hAnsi="Times New Roman" w:cs="Times New Roman"/>
+          <w:sz w:val="22"/>
+          <w:szCs w:val="22"/>
+          <w:lang w:val="en-US"/>
+        </w:rPr>
+        <w:t>portfolio</w:t>
+      </w:r>
+      <w:r>
+        <w:rPr>
+          <w:rFonts w:ascii="Times New Roman" w:hAnsi="Times New Roman" w:cs="Times New Roman"/>
+          <w:sz w:val="22"/>
+          <w:szCs w:val="22"/>
+          <w:lang w:val="en-US"/>
+        </w:rPr>
+        <w:t xml:space="preserve"> transactions. </w:t>
+      </w:r>
     </w:p>
     <w:p>
       <w:pPr>
@@ -2708,7 +2753,7 @@
       <w:pPr>
         <w:jc w:val="both"/>
         <w:rPr>
-          <w:rFonts w:ascii="Times New Roman" w:hAnsi="Times New Roman" w:cs="Times New Roman" w:hint="eastAsia"/>
+          <w:rFonts w:ascii="Times New Roman" w:hAnsi="Times New Roman" w:cs="Times New Roman"/>
           <w:sz w:val="22"/>
           <w:szCs w:val="22"/>
           <w:lang w:val="en-US"/>
@@ -2928,7 +2973,7 @@
       <w:pPr>
         <w:jc w:val="both"/>
         <w:rPr>
-          <w:rFonts w:ascii="Times New Roman" w:hAnsi="Times New Roman" w:cs="Times New Roman" w:hint="eastAsia"/>
+          <w:rFonts w:ascii="Times New Roman" w:hAnsi="Times New Roman" w:cs="Times New Roman"/>
           <w:sz w:val="22"/>
           <w:szCs w:val="22"/>
           <w:lang w:val="en-US"/>
@@ -3256,18 +3301,18 @@
       <w:pPr>
         <w:jc w:val="both"/>
         <w:rPr>
-          <w:rFonts w:ascii="Times New Roman" w:hAnsi="Times New Roman" w:cs="Times New Roman" w:hint="eastAsia"/>
-          <w:sz w:val="22"/>
-          <w:szCs w:val="22"/>
-          <w:lang w:val="en-US"/>
-        </w:rPr>
-      </w:pPr>
-    </w:p>
-    <w:p>
-      <w:pPr>
-        <w:jc w:val="both"/>
-        <w:rPr>
-          <w:rFonts w:ascii="Times New Roman" w:hAnsi="Times New Roman" w:cs="Times New Roman" w:hint="eastAsia"/>
+          <w:rFonts w:ascii="Times New Roman" w:hAnsi="Times New Roman" w:cs="Times New Roman"/>
+          <w:sz w:val="22"/>
+          <w:szCs w:val="22"/>
+          <w:lang w:val="en-US"/>
+        </w:rPr>
+      </w:pPr>
+    </w:p>
+    <w:p>
+      <w:pPr>
+        <w:jc w:val="both"/>
+        <w:rPr>
+          <w:rFonts w:ascii="Times New Roman" w:hAnsi="Times New Roman" w:cs="Times New Roman"/>
           <w:sz w:val="22"/>
           <w:szCs w:val="22"/>
           <w:lang w:val="en-US"/>
@@ -3472,7 +3517,6 @@
           <w:szCs w:val="22"/>
           <w:lang w:val="en-US"/>
         </w:rPr>
-        <w:lastRenderedPageBreak/>
         <w:t xml:space="preserve">Feature </w:t>
       </w:r>
       <w:proofErr w:type="spellStart"/>
@@ -3656,25 +3700,7 @@
           <w:szCs w:val="22"/>
           <w:lang w:val="en-US"/>
         </w:rPr>
-        <w:t xml:space="preserve"> feature from the dataset due to the lack of valid observations. </w:t>
-      </w:r>
-      <w:r>
-        <w:rPr>
-          <w:rFonts w:ascii="Times New Roman" w:hAnsi="Times New Roman" w:cs="Times New Roman"/>
-          <w:sz w:val="22"/>
-          <w:szCs w:val="22"/>
-          <w:lang w:val="en-US"/>
-        </w:rPr>
-        <w:t>S</w:t>
-      </w:r>
-      <w:r>
-        <w:rPr>
-          <w:rFonts w:ascii="Times New Roman" w:hAnsi="Times New Roman" w:cs="Times New Roman"/>
-          <w:sz w:val="22"/>
-          <w:szCs w:val="22"/>
-          <w:lang w:val="en-US"/>
-        </w:rPr>
-        <w:t>econd</w:t>
+        <w:t xml:space="preserve"> feature from the dataset due to the lack of valid observations. Second</w:t>
       </w:r>
       <w:r>
         <w:rPr>
@@ -4081,31 +4107,228 @@
       <w:pPr>
         <w:jc w:val="both"/>
         <w:rPr>
+          <w:rFonts w:ascii="Times New Roman" w:hAnsi="Times New Roman" w:cs="Times New Roman"/>
+          <w:sz w:val="22"/>
+          <w:szCs w:val="22"/>
+          <w:lang w:val="en-US"/>
+        </w:rPr>
+      </w:pPr>
+    </w:p>
+    <w:p>
+      <w:pPr>
+        <w:jc w:val="both"/>
+        <w:rPr>
+          <w:rFonts w:ascii="Times New Roman" w:hAnsi="Times New Roman" w:cs="Times New Roman"/>
+          <w:sz w:val="22"/>
+          <w:szCs w:val="22"/>
+          <w:lang w:val="en-US"/>
+        </w:rPr>
+      </w:pPr>
+      <w:r>
+        <w:rPr>
+          <w:rFonts w:ascii="Times New Roman" w:hAnsi="Times New Roman" w:cs="Times New Roman"/>
+          <w:sz w:val="22"/>
+          <w:szCs w:val="22"/>
+          <w:lang w:val="en-US"/>
+        </w:rPr>
+        <w:t xml:space="preserve">To address these issues, several data cleaning and transformation strategies are applied. The </w:t>
+      </w:r>
+      <w:proofErr w:type="spellStart"/>
+      <w:r>
+        <w:rPr>
+          <w:rFonts w:ascii="Times New Roman" w:hAnsi="Times New Roman" w:cs="Times New Roman"/>
+          <w:i/>
+          <w:iCs/>
+          <w:sz w:val="22"/>
+          <w:szCs w:val="22"/>
+          <w:lang w:val="en-US"/>
+        </w:rPr>
+        <w:t>DateofSale</w:t>
+      </w:r>
+      <w:proofErr w:type="spellEnd"/>
+      <w:r>
+        <w:rPr>
+          <w:rFonts w:ascii="Times New Roman" w:hAnsi="Times New Roman" w:cs="Times New Roman"/>
+          <w:i/>
+          <w:iCs/>
+          <w:sz w:val="22"/>
+          <w:szCs w:val="22"/>
+          <w:lang w:val="en-US"/>
+        </w:rPr>
+        <w:t>(dd/mm/</w:t>
+      </w:r>
+      <w:proofErr w:type="spellStart"/>
+      <w:r>
+        <w:rPr>
+          <w:rFonts w:ascii="Times New Roman" w:hAnsi="Times New Roman" w:cs="Times New Roman"/>
+          <w:i/>
+          <w:iCs/>
+          <w:sz w:val="22"/>
+          <w:szCs w:val="22"/>
+          <w:lang w:val="en-US"/>
+        </w:rPr>
+        <w:t>yyyy</w:t>
+      </w:r>
+      <w:proofErr w:type="spellEnd"/>
+      <w:r>
+        <w:rPr>
+          <w:rFonts w:ascii="Times New Roman" w:hAnsi="Times New Roman" w:cs="Times New Roman"/>
+          <w:i/>
+          <w:iCs/>
+          <w:sz w:val="22"/>
+          <w:szCs w:val="22"/>
+          <w:lang w:val="en-US"/>
+        </w:rPr>
+        <w:t>)</w:t>
+      </w:r>
+      <w:r>
+        <w:rPr>
+          <w:rFonts w:ascii="Times New Roman" w:hAnsi="Times New Roman" w:cs="Times New Roman"/>
+          <w:sz w:val="22"/>
+          <w:szCs w:val="22"/>
+          <w:lang w:val="en-US"/>
+        </w:rPr>
+        <w:t xml:space="preserve"> feature is transformed into </w:t>
+      </w:r>
+      <w:proofErr w:type="spellStart"/>
+      <w:r>
+        <w:rPr>
+          <w:rFonts w:ascii="Times New Roman" w:hAnsi="Times New Roman" w:cs="Times New Roman"/>
+          <w:i/>
+          <w:iCs/>
+          <w:sz w:val="22"/>
+          <w:szCs w:val="22"/>
+          <w:lang w:val="en-US"/>
+        </w:rPr>
+        <w:t>SaleYear</w:t>
+      </w:r>
+      <w:proofErr w:type="spellEnd"/>
+      <w:r>
+        <w:rPr>
+          <w:rFonts w:ascii="Times New Roman" w:hAnsi="Times New Roman" w:cs="Times New Roman"/>
+          <w:sz w:val="22"/>
+          <w:szCs w:val="22"/>
+          <w:lang w:val="en-US"/>
+        </w:rPr>
+        <w:t xml:space="preserve"> and </w:t>
+      </w:r>
+      <w:proofErr w:type="spellStart"/>
+      <w:r>
+        <w:rPr>
+          <w:rFonts w:ascii="Times New Roman" w:hAnsi="Times New Roman" w:cs="Times New Roman"/>
+          <w:i/>
+          <w:iCs/>
+          <w:sz w:val="22"/>
+          <w:szCs w:val="22"/>
+          <w:lang w:val="en-US"/>
+        </w:rPr>
+        <w:t>SaleMonth</w:t>
+      </w:r>
+      <w:proofErr w:type="spellEnd"/>
+      <w:r>
+        <w:rPr>
+          <w:rFonts w:ascii="Times New Roman" w:hAnsi="Times New Roman" w:cs="Times New Roman"/>
+          <w:sz w:val="22"/>
+          <w:szCs w:val="22"/>
+          <w:lang w:val="en-US"/>
+        </w:rPr>
+        <w:t xml:space="preserve"> to reduce cardinality</w:t>
+      </w:r>
+      <w:r>
+        <w:rPr>
           <w:rFonts w:ascii="Times New Roman" w:hAnsi="Times New Roman" w:cs="Times New Roman" w:hint="eastAsia"/>
           <w:sz w:val="22"/>
           <w:szCs w:val="22"/>
           <w:lang w:val="en-US"/>
         </w:rPr>
-      </w:pPr>
-    </w:p>
-    <w:p>
-      <w:pPr>
-        <w:jc w:val="both"/>
-        <w:rPr>
-          <w:rFonts w:ascii="Times New Roman" w:hAnsi="Times New Roman" w:cs="Times New Roman"/>
-          <w:sz w:val="22"/>
-          <w:szCs w:val="22"/>
-          <w:lang w:val="en-US"/>
-        </w:rPr>
-      </w:pPr>
-      <w:r>
-        <w:rPr>
-          <w:rFonts w:ascii="Times New Roman" w:hAnsi="Times New Roman" w:cs="Times New Roman"/>
-          <w:sz w:val="22"/>
-          <w:szCs w:val="22"/>
-          <w:lang w:val="en-US"/>
-        </w:rPr>
-        <w:t xml:space="preserve">To address these issues, several data cleaning and transformation strategies are applied. The </w:t>
+        <w:t xml:space="preserve"> </w:t>
+      </w:r>
+      <w:r>
+        <w:rPr>
+          <w:rFonts w:ascii="Times New Roman" w:hAnsi="Times New Roman" w:cs="Times New Roman"/>
+          <w:sz w:val="22"/>
+          <w:szCs w:val="22"/>
+          <w:lang w:val="en-US"/>
+        </w:rPr>
+        <w:t xml:space="preserve">and to provide monthly aggregated analysis. Similarly, feature </w:t>
+      </w:r>
+      <w:r>
+        <w:rPr>
+          <w:rFonts w:ascii="Times New Roman" w:hAnsi="Times New Roman" w:cs="Times New Roman"/>
+          <w:i/>
+          <w:iCs/>
+          <w:sz w:val="22"/>
+          <w:szCs w:val="22"/>
+          <w:lang w:val="en-US"/>
+        </w:rPr>
+        <w:t>Address</w:t>
+      </w:r>
+      <w:r>
+        <w:rPr>
+          <w:rFonts w:ascii="Times New Roman" w:hAnsi="Times New Roman" w:cs="Times New Roman"/>
+          <w:sz w:val="22"/>
+          <w:szCs w:val="22"/>
+          <w:lang w:val="en-US"/>
+        </w:rPr>
+        <w:t xml:space="preserve"> is </w:t>
+      </w:r>
+      <w:r>
+        <w:rPr>
+          <w:rFonts w:ascii="Times New Roman" w:hAnsi="Times New Roman" w:cs="Times New Roman"/>
+          <w:sz w:val="22"/>
+          <w:szCs w:val="22"/>
+          <w:lang w:val="en-US"/>
+        </w:rPr>
+        <w:t>extracted</w:t>
+      </w:r>
+      <w:r>
+        <w:rPr>
+          <w:rFonts w:ascii="Times New Roman" w:hAnsi="Times New Roman" w:cs="Times New Roman"/>
+          <w:sz w:val="22"/>
+          <w:szCs w:val="22"/>
+          <w:lang w:val="en-US"/>
+        </w:rPr>
+        <w:t xml:space="preserve"> into a new </w:t>
+      </w:r>
+      <w:r>
+        <w:rPr>
+          <w:rFonts w:ascii="Times New Roman" w:hAnsi="Times New Roman" w:cs="Times New Roman"/>
+          <w:i/>
+          <w:iCs/>
+          <w:sz w:val="22"/>
+          <w:szCs w:val="22"/>
+          <w:lang w:val="en-US"/>
+        </w:rPr>
+        <w:t>Region</w:t>
+      </w:r>
+      <w:r>
+        <w:rPr>
+          <w:rFonts w:ascii="Times New Roman" w:hAnsi="Times New Roman" w:cs="Times New Roman"/>
+          <w:sz w:val="22"/>
+          <w:szCs w:val="22"/>
+          <w:lang w:val="en-US"/>
+        </w:rPr>
+        <w:t xml:space="preserve"> feature to capture geographic patterns, particularly within Dublin. Features with limited analytical value, such as </w:t>
+      </w:r>
+      <w:r>
+        <w:rPr>
+          <w:rFonts w:ascii="Times New Roman" w:hAnsi="Times New Roman" w:cs="Times New Roman"/>
+          <w:i/>
+          <w:iCs/>
+          <w:sz w:val="22"/>
+          <w:szCs w:val="22"/>
+          <w:lang w:val="en-US"/>
+        </w:rPr>
+        <w:t>Eircode</w:t>
+      </w:r>
+      <w:r>
+        <w:rPr>
+          <w:rFonts w:ascii="Times New Roman" w:hAnsi="Times New Roman" w:cs="Times New Roman"/>
+          <w:sz w:val="22"/>
+          <w:szCs w:val="22"/>
+          <w:lang w:val="en-US"/>
+        </w:rPr>
+        <w:t xml:space="preserve"> and </w:t>
       </w:r>
       <w:proofErr w:type="spellStart"/>
       <w:r>
@@ -4117,209 +4340,12 @@
           <w:szCs w:val="22"/>
           <w:lang w:val="en-US"/>
         </w:rPr>
-        <w:t>DateofSale</w:t>
+        <w:t>PropertySizeDescription</w:t>
       </w:r>
       <w:proofErr w:type="spellEnd"/>
       <w:r>
         <w:rPr>
           <w:rFonts w:ascii="Times New Roman" w:hAnsi="Times New Roman" w:cs="Times New Roman"/>
-          <w:i/>
-          <w:iCs/>
-          <w:sz w:val="22"/>
-          <w:szCs w:val="22"/>
-          <w:lang w:val="en-US"/>
-        </w:rPr>
-        <w:t>(dd/mm/</w:t>
-      </w:r>
-      <w:proofErr w:type="spellStart"/>
-      <w:r>
-        <w:rPr>
-          <w:rFonts w:ascii="Times New Roman" w:hAnsi="Times New Roman" w:cs="Times New Roman"/>
-          <w:i/>
-          <w:iCs/>
-          <w:sz w:val="22"/>
-          <w:szCs w:val="22"/>
-          <w:lang w:val="en-US"/>
-        </w:rPr>
-        <w:t>yyyy</w:t>
-      </w:r>
-      <w:proofErr w:type="spellEnd"/>
-      <w:r>
-        <w:rPr>
-          <w:rFonts w:ascii="Times New Roman" w:hAnsi="Times New Roman" w:cs="Times New Roman"/>
-          <w:i/>
-          <w:iCs/>
-          <w:sz w:val="22"/>
-          <w:szCs w:val="22"/>
-          <w:lang w:val="en-US"/>
-        </w:rPr>
-        <w:t>)</w:t>
-      </w:r>
-      <w:r>
-        <w:rPr>
-          <w:rFonts w:ascii="Times New Roman" w:hAnsi="Times New Roman" w:cs="Times New Roman"/>
-          <w:sz w:val="22"/>
-          <w:szCs w:val="22"/>
-          <w:lang w:val="en-US"/>
-        </w:rPr>
-        <w:t xml:space="preserve"> feature is transformed into </w:t>
-      </w:r>
-      <w:proofErr w:type="spellStart"/>
-      <w:r>
-        <w:rPr>
-          <w:rFonts w:ascii="Times New Roman" w:hAnsi="Times New Roman" w:cs="Times New Roman"/>
-          <w:i/>
-          <w:iCs/>
-          <w:sz w:val="22"/>
-          <w:szCs w:val="22"/>
-          <w:lang w:val="en-US"/>
-        </w:rPr>
-        <w:t>SaleYear</w:t>
-      </w:r>
-      <w:proofErr w:type="spellEnd"/>
-      <w:r>
-        <w:rPr>
-          <w:rFonts w:ascii="Times New Roman" w:hAnsi="Times New Roman" w:cs="Times New Roman"/>
-          <w:sz w:val="22"/>
-          <w:szCs w:val="22"/>
-          <w:lang w:val="en-US"/>
-        </w:rPr>
-        <w:t xml:space="preserve"> and </w:t>
-      </w:r>
-      <w:proofErr w:type="spellStart"/>
-      <w:r>
-        <w:rPr>
-          <w:rFonts w:ascii="Times New Roman" w:hAnsi="Times New Roman" w:cs="Times New Roman"/>
-          <w:i/>
-          <w:iCs/>
-          <w:sz w:val="22"/>
-          <w:szCs w:val="22"/>
-          <w:lang w:val="en-US"/>
-        </w:rPr>
-        <w:t>SaleMonth</w:t>
-      </w:r>
-      <w:proofErr w:type="spellEnd"/>
-      <w:r>
-        <w:rPr>
-          <w:rFonts w:ascii="Times New Roman" w:hAnsi="Times New Roman" w:cs="Times New Roman"/>
-          <w:sz w:val="22"/>
-          <w:szCs w:val="22"/>
-          <w:lang w:val="en-US"/>
-        </w:rPr>
-        <w:t xml:space="preserve"> to reduce cardinality</w:t>
-      </w:r>
-      <w:r>
-        <w:rPr>
-          <w:rFonts w:ascii="Times New Roman" w:hAnsi="Times New Roman" w:cs="Times New Roman" w:hint="eastAsia"/>
-          <w:sz w:val="22"/>
-          <w:szCs w:val="22"/>
-          <w:lang w:val="en-US"/>
-        </w:rPr>
-        <w:t xml:space="preserve"> </w:t>
-      </w:r>
-      <w:r>
-        <w:rPr>
-          <w:rFonts w:ascii="Times New Roman" w:hAnsi="Times New Roman" w:cs="Times New Roman"/>
-          <w:sz w:val="22"/>
-          <w:szCs w:val="22"/>
-          <w:lang w:val="en-US"/>
-        </w:rPr>
-        <w:t xml:space="preserve">and to provide monthly aggregated analysis. Similarly, feature </w:t>
-      </w:r>
-      <w:r>
-        <w:rPr>
-          <w:rFonts w:ascii="Times New Roman" w:hAnsi="Times New Roman" w:cs="Times New Roman"/>
-          <w:i/>
-          <w:iCs/>
-          <w:sz w:val="22"/>
-          <w:szCs w:val="22"/>
-          <w:lang w:val="en-US"/>
-        </w:rPr>
-        <w:t>Address</w:t>
-      </w:r>
-      <w:r>
-        <w:rPr>
-          <w:rFonts w:ascii="Times New Roman" w:hAnsi="Times New Roman" w:cs="Times New Roman"/>
-          <w:sz w:val="22"/>
-          <w:szCs w:val="22"/>
-          <w:lang w:val="en-US"/>
-        </w:rPr>
-        <w:t xml:space="preserve"> is </w:t>
-      </w:r>
-      <w:r>
-        <w:rPr>
-          <w:rFonts w:ascii="Times New Roman" w:hAnsi="Times New Roman" w:cs="Times New Roman"/>
-          <w:sz w:val="22"/>
-          <w:szCs w:val="22"/>
-          <w:lang w:val="en-US"/>
-        </w:rPr>
-        <w:t>extracted</w:t>
-      </w:r>
-      <w:r>
-        <w:rPr>
-          <w:rFonts w:ascii="Times New Roman" w:hAnsi="Times New Roman" w:cs="Times New Roman"/>
-          <w:sz w:val="22"/>
-          <w:szCs w:val="22"/>
-          <w:lang w:val="en-US"/>
-        </w:rPr>
-        <w:t xml:space="preserve"> into a new </w:t>
-      </w:r>
-      <w:r>
-        <w:rPr>
-          <w:rFonts w:ascii="Times New Roman" w:hAnsi="Times New Roman" w:cs="Times New Roman"/>
-          <w:i/>
-          <w:iCs/>
-          <w:sz w:val="22"/>
-          <w:szCs w:val="22"/>
-          <w:lang w:val="en-US"/>
-        </w:rPr>
-        <w:t>Region</w:t>
-      </w:r>
-      <w:r>
-        <w:rPr>
-          <w:rFonts w:ascii="Times New Roman" w:hAnsi="Times New Roman" w:cs="Times New Roman"/>
-          <w:sz w:val="22"/>
-          <w:szCs w:val="22"/>
-          <w:lang w:val="en-US"/>
-        </w:rPr>
-        <w:t xml:space="preserve"> feature to capture geographic patterns, particularly within Dublin. Features with limited analytical value, such as </w:t>
-      </w:r>
-      <w:r>
-        <w:rPr>
-          <w:rFonts w:ascii="Times New Roman" w:hAnsi="Times New Roman" w:cs="Times New Roman"/>
-          <w:i/>
-          <w:iCs/>
-          <w:sz w:val="22"/>
-          <w:szCs w:val="22"/>
-          <w:lang w:val="en-US"/>
-        </w:rPr>
-        <w:t>Eircode</w:t>
-      </w:r>
-      <w:r>
-        <w:rPr>
-          <w:rFonts w:ascii="Times New Roman" w:hAnsi="Times New Roman" w:cs="Times New Roman"/>
-          <w:sz w:val="22"/>
-          <w:szCs w:val="22"/>
-          <w:lang w:val="en-US"/>
-        </w:rPr>
-        <w:t xml:space="preserve"> and </w:t>
-      </w:r>
-      <w:proofErr w:type="spellStart"/>
-      <w:r>
-        <w:rPr>
-          <w:rFonts w:ascii="Times New Roman" w:hAnsi="Times New Roman" w:cs="Times New Roman"/>
-          <w:i/>
-          <w:iCs/>
-          <w:sz w:val="22"/>
-          <w:szCs w:val="22"/>
-          <w:lang w:val="en-US"/>
-        </w:rPr>
-        <w:t>PropertySizeDescription</w:t>
-      </w:r>
-      <w:proofErr w:type="spellEnd"/>
-      <w:r>
-        <w:rPr>
-          <w:rFonts w:ascii="Times New Roman" w:hAnsi="Times New Roman" w:cs="Times New Roman"/>
           <w:sz w:val="22"/>
           <w:szCs w:val="22"/>
           <w:lang w:val="en-US"/>
@@ -4405,7 +4431,7 @@
       <w:pPr>
         <w:jc w:val="both"/>
         <w:rPr>
-          <w:rFonts w:ascii="Times New Roman" w:hAnsi="Times New Roman" w:cs="Times New Roman" w:hint="eastAsia"/>
+          <w:rFonts w:ascii="Times New Roman" w:hAnsi="Times New Roman" w:cs="Times New Roman"/>
           <w:sz w:val="22"/>
           <w:szCs w:val="22"/>
           <w:lang w:val="en-US"/>
@@ -4564,6 +4590,7 @@
       <w:r>
         <w:rPr>
           <w:rFonts w:ascii="Times New Roman" w:hAnsi="Times New Roman" w:cs="Times New Roman"/>
+          <w:noProof/>
           <w:lang w:val="en-US"/>
         </w:rPr>
         <w:drawing>
@@ -4657,6 +4684,7 @@
       <w:r>
         <w:rPr>
           <w:rFonts w:ascii="Times New Roman" w:hAnsi="Times New Roman" w:cs="Times New Roman"/>
+          <w:noProof/>
           <w:lang w:val="en-US"/>
         </w:rPr>
         <w:drawing>
@@ -4741,6 +4769,7 @@
       <w:r>
         <w:rPr>
           <w:rFonts w:ascii="Times New Roman" w:hAnsi="Times New Roman" w:cs="Times New Roman"/>
+          <w:noProof/>
           <w:lang w:val="en-US"/>
         </w:rPr>
         <w:lastRenderedPageBreak/>

</xml_diff>